<commit_message>
Verify and remove benchmarch performance
</commit_message>
<xml_diff>
--- a/Documents/Deployment_Operations_Guide.docx
+++ b/Documents/Deployment_Operations_Guide.docx
@@ -3594,7 +3594,7 @@
           <w:sz w:val="26"/>
           <w:szCs w:val="26"/>
         </w:rPr>
-        <w:t xml:space="preserve">Step 4.5: Install Visual Studio 2022 Community</w:t>
+        <w:t xml:space="preserve">Step 4.5: Install Visual Studio 2026 Community</w:t>
       </w:r>
     </w:p>
     <w:p>
@@ -3612,7 +3612,7 @@
           <w:sz w:val="20"/>
           <w:szCs w:val="20"/>
         </w:rPr>
-        <w:t xml:space="preserve">Download Visual Studio 2022 Community from https://visualstudio.microsoft.com/downloads/</w:t>
+        <w:t xml:space="preserve">Download Visual Studio 2026 Community from https://visualstudio.microsoft.com/downloads/</w:t>
       </w:r>
     </w:p>
     <w:p>

</xml_diff>